<commit_message>
docs: add stage goals and update DOCX files
</commit_message>
<xml_diff>
--- a/giao_an_7.6_tiet_1.docx
+++ b/giao_an_7.6_tiet_1.docx
@@ -536,6 +536,30 @@
         <w:rPr>
           <w:b w:val="0"/>
         </w:rPr>
+        <w:t>Mục tiêu:</w:t>
+      </w:r>
+    </w:p>
+    <w:p>
+      <w:pPr>
+        <w:pStyle w:val="ListBullet"/>
+        <w:spacing w:after="60"/>
+      </w:pPr>
+      <w:r>
+        <w:rPr>
+          <w:b w:val="0"/>
+        </w:rPr>
+        <w:t>Giúp học sinh nhận diện khái niệm "bão cảm xúc" và phát hiện ra nguyên lý sơ cứu cảm xúc đầu tiên là "Tạm dừng".</w:t>
+      </w:r>
+    </w:p>
+    <w:p>
+      <w:pPr>
+        <w:pStyle w:val="ListBullet"/>
+        <w:spacing w:after="60"/>
+      </w:pPr>
+      <w:r>
+        <w:rPr>
+          <w:b w:val="0"/>
+        </w:rPr>
         <w:t>Giao nhiệm vụ:</w:t>
       </w:r>
     </w:p>
@@ -1035,6 +1059,30 @@
         <w:rPr>
           <w:b w:val="0"/>
         </w:rPr>
+        <w:t>Mục tiêu:</w:t>
+      </w:r>
+    </w:p>
+    <w:p>
+      <w:pPr>
+        <w:pStyle w:val="ListBullet"/>
+        <w:spacing w:after="60"/>
+      </w:pPr>
+      <w:r>
+        <w:rPr>
+          <w:b w:val="0"/>
+        </w:rPr>
+        <w:t>Giúp học sinh bốc thăm ngẫu nhiên hồ sơ bệnh án và chuẩn bị kíp trực để phân tích ca bệnh.</w:t>
+      </w:r>
+    </w:p>
+    <w:p>
+      <w:pPr>
+        <w:pStyle w:val="ListBullet"/>
+        <w:spacing w:after="60"/>
+      </w:pPr>
+      <w:r>
+        <w:rPr>
+          <w:b w:val="0"/>
+        </w:rPr>
         <w:t>Giao nhiệm vụ:</w:t>
       </w:r>
     </w:p>
@@ -1256,6 +1304,30 @@
         <w:rPr>
           <w:b w:val="0"/>
         </w:rPr>
+        <w:t>Mục tiêu:</w:t>
+      </w:r>
+    </w:p>
+    <w:p>
+      <w:pPr>
+        <w:pStyle w:val="ListBullet"/>
+        <w:spacing w:after="60"/>
+      </w:pPr>
+      <w:r>
+        <w:rPr>
+          <w:b w:val="0"/>
+        </w:rPr>
+        <w:t>Giúp học sinh nhận diện và phân tích chính xác các biểu hiện cơ thể khi có cảm xúc mạnh.</w:t>
+      </w:r>
+    </w:p>
+    <w:p>
+      <w:pPr>
+        <w:pStyle w:val="ListBullet"/>
+        <w:spacing w:after="60"/>
+      </w:pPr>
+      <w:r>
+        <w:rPr>
+          <w:b w:val="0"/>
+        </w:rPr>
         <w:t>Giao nhiệm vụ:</w:t>
       </w:r>
     </w:p>
@@ -1609,6 +1681,30 @@
         <w:rPr>
           <w:b w:val="0"/>
         </w:rPr>
+        <w:t>Mục tiêu:</w:t>
+      </w:r>
+    </w:p>
+    <w:p>
+      <w:pPr>
+        <w:pStyle w:val="ListBullet"/>
+        <w:spacing w:after="60"/>
+      </w:pPr>
+      <w:r>
+        <w:rPr>
+          <w:b w:val="0"/>
+        </w:rPr>
+        <w:t>Giúp học sinh giải thích được cơ chế cabin não bộ mất cân bằng sinh lý ở tuổi dậy thì.</w:t>
+      </w:r>
+    </w:p>
+    <w:p>
+      <w:pPr>
+        <w:pStyle w:val="ListBullet"/>
+        <w:spacing w:after="60"/>
+      </w:pPr>
+      <w:r>
+        <w:rPr>
+          <w:b w:val="0"/>
+        </w:rPr>
         <w:t>Giao nhiệm vụ:</w:t>
       </w:r>
     </w:p>
@@ -1890,6 +1986,30 @@
         <w:rPr>
           <w:b w:val="0"/>
         </w:rPr>
+        <w:t>Mục tiêu:</w:t>
+      </w:r>
+    </w:p>
+    <w:p>
+      <w:pPr>
+        <w:pStyle w:val="ListBullet"/>
+        <w:spacing w:after="60"/>
+      </w:pPr>
+      <w:r>
+        <w:rPr>
+          <w:b w:val="0"/>
+        </w:rPr>
+        <w:t>Giúp học sinh củng cố kỹ năng trình bày khoa học và cam kết thực thi y đức.</w:t>
+      </w:r>
+    </w:p>
+    <w:p>
+      <w:pPr>
+        <w:pStyle w:val="ListBullet"/>
+        <w:spacing w:after="60"/>
+      </w:pPr>
+      <w:r>
+        <w:rPr>
+          <w:b w:val="0"/>
+        </w:rPr>
         <w:t>Giao nhiệm vụ:</w:t>
       </w:r>
     </w:p>
@@ -2171,6 +2291,30 @@
         <w:rPr>
           <w:b w:val="0"/>
         </w:rPr>
+        <w:t>Mục tiêu:</w:t>
+      </w:r>
+    </w:p>
+    <w:p>
+      <w:pPr>
+        <w:pStyle w:val="ListBullet"/>
+        <w:spacing w:after="60"/>
+      </w:pPr>
+      <w:r>
+        <w:rPr>
+          <w:b w:val="0"/>
+        </w:rPr>
+        <w:t>Giúp học sinh thực hành thành thạo phác đồ 5 bước và thực hiện đúng kỹ thuật thở sâu.</w:t>
+      </w:r>
+    </w:p>
+    <w:p>
+      <w:pPr>
+        <w:pStyle w:val="ListBullet"/>
+        <w:spacing w:after="60"/>
+      </w:pPr>
+      <w:r>
+        <w:rPr>
+          <w:b w:val="0"/>
+        </w:rPr>
         <w:t>Giao nhiệm vụ:</w:t>
       </w:r>
     </w:p>
@@ -2742,6 +2886,30 @@
         <w:rPr>
           <w:b w:val="0"/>
         </w:rPr>
+        <w:t>Mục tiêu:</w:t>
+      </w:r>
+    </w:p>
+    <w:p>
+      <w:pPr>
+        <w:pStyle w:val="ListBullet"/>
+        <w:spacing w:after="60"/>
+      </w:pPr>
+      <w:r>
+        <w:rPr>
+          <w:b w:val="0"/>
+        </w:rPr>
+        <w:t>Giúp học sinh tự phân loại các hành động an toàn/rủi ro để áp dụng giải pháp sơ cứu thích hợp.</w:t>
+      </w:r>
+    </w:p>
+    <w:p>
+      <w:pPr>
+        <w:pStyle w:val="ListBullet"/>
+        <w:spacing w:after="60"/>
+      </w:pPr>
+      <w:r>
+        <w:rPr>
+          <w:b w:val="0"/>
+        </w:rPr>
         <w:t>Giao nhiệm vụ:</w:t>
       </w:r>
     </w:p>
@@ -3146,6 +3314,30 @@
           <w:sz w:val="24"/>
         </w:rPr>
         <w:t>* Giai đoạn 8: Thói quen khỏe mạnh</w:t>
+      </w:r>
+    </w:p>
+    <w:p>
+      <w:pPr>
+        <w:pStyle w:val="ListBullet"/>
+        <w:spacing w:after="60"/>
+      </w:pPr>
+      <w:r>
+        <w:rPr>
+          <w:b w:val="0"/>
+        </w:rPr>
+        <w:t>Mục tiêu:</w:t>
+      </w:r>
+    </w:p>
+    <w:p>
+      <w:pPr>
+        <w:pStyle w:val="ListBullet"/>
+        <w:spacing w:after="60"/>
+      </w:pPr>
+      <w:r>
+        <w:rPr>
+          <w:b w:val="0"/>
+        </w:rPr>
+        <w:t>Giúp học sinh củng cố thói quen tự phản tư và đánh giá cảm xúc bản thân hàng ngày.</w:t>
       </w:r>
     </w:p>
     <w:p>

</xml_diff>

<commit_message>
docs: condense lesson plans and update DOCX files
</commit_message>
<xml_diff>
--- a/giao_an_7.6_tiet_1.docx
+++ b/giao_an_7.6_tiet_1.docx
@@ -99,19 +99,20 @@
     </w:p>
     <w:p>
       <w:pPr>
-        <w:spacing w:after="120"/>
-      </w:pPr>
-    </w:p>
-    <w:p>
-      <w:pPr>
-        <w:pStyle w:val="Heading4"/>
-        <w:spacing w:before="120" w:after="80"/>
-      </w:pPr>
+        <w:pStyle w:val="ListBullet"/>
+        <w:spacing w:after="60"/>
+      </w:pPr>
+      <w:r>
+        <w:rPr>
+          <w:b/>
+        </w:rPr>
+        <w:t>Giáo viên chuẩn bị:</w:t>
+      </w:r>
       <w:r>
         <w:rPr>
           <w:b w:val="0"/>
         </w:rPr>
-        <w:t>1. Giáo viên chuẩn bị:</w:t>
+        <w:t xml:space="preserve"> Máy tính, thiết bị chạy slide `tiet1.html` (có âm thanh báo động còi cứu thương); 4 bộ hồ sơ bệnh án lâm sàng giấy (Su, Minh Anh, Kem, Bảo Vy); con dấu đỏ "ĐÃ PHÊ DUYỆT".</w:t>
       </w:r>
     </w:p>
     <w:p>
@@ -123,204 +124,13 @@
         <w:rPr>
           <w:b/>
         </w:rPr>
-        <w:t>Thiết bị điện tử:</w:t>
+        <w:t>Học sinh chuẩn bị:</w:t>
       </w:r>
-    </w:p>
-    <w:p>
-      <w:pPr>
-        <w:pStyle w:val="ListBullet"/>
-        <w:spacing w:after="60"/>
-      </w:pPr>
       <w:r>
         <w:rPr>
           <w:b w:val="0"/>
         </w:rPr>
-        <w:t>Máy tính cá nhân kết nối hệ thống loa âm thanh lớp học.</w:t>
-      </w:r>
-    </w:p>
-    <w:p>
-      <w:pPr>
-        <w:pStyle w:val="ListBullet"/>
-        <w:spacing w:after="60"/>
-      </w:pPr>
-      <w:r>
-        <w:rPr>
-          <w:b w:val="0"/>
-        </w:rPr>
-        <w:t>Máy chiếu hoặc thiết bị chạy mượt mà tệp slide trình chiếu tương tác `tiet1.html` (chứa âm thanh cứu thương khẩn cấp tự động và hiệu ứng hình ảnh nhấp nháy báo động).</w:t>
-      </w:r>
-    </w:p>
-    <w:p>
-      <w:pPr>
-        <w:pStyle w:val="ListBullet"/>
-        <w:spacing w:after="60"/>
-      </w:pPr>
-      <w:r>
-        <w:rPr>
-          <w:b/>
-        </w:rPr>
-        <w:t>Học liệu in ấn:</w:t>
-      </w:r>
-    </w:p>
-    <w:p>
-      <w:pPr>
-        <w:pStyle w:val="ListBullet"/>
-        <w:spacing w:after="60"/>
-      </w:pPr>
-      <w:r>
-        <w:rPr>
-          <w:b w:val="0"/>
-        </w:rPr>
-        <w:t>4 bộ "Hồ sơ bệnh án lâm sàng" khổ giấy A4 tương ứng với 4 nhân vật (Su, Minh Anh, Kem, Bảo Vy) in phát cho các kíp trực.</w:t>
-      </w:r>
-    </w:p>
-    <w:p>
-      <w:pPr>
-        <w:pStyle w:val="ListBullet"/>
-        <w:spacing w:after="60"/>
-      </w:pPr>
-      <w:r>
-        <w:rPr>
-          <w:b w:val="0"/>
-        </w:rPr>
-        <w:t>01 bản in "Phác đồ điều hòa cảm xúc 5 bước" khổ lớn (A1 hoặc A0) treo tại bảng chính của lớp học.</w:t>
-      </w:r>
-    </w:p>
-    <w:p>
-      <w:pPr>
-        <w:pStyle w:val="ListBullet"/>
-        <w:spacing w:after="60"/>
-      </w:pPr>
-      <w:r>
-        <w:rPr>
-          <w:b w:val="0"/>
-        </w:rPr>
-        <w:t>Phiếu hướng dẫn tự đếm và ghi nhịp tim cơ thể trước - sau khi thở sâu.</w:t>
-      </w:r>
-    </w:p>
-    <w:p>
-      <w:pPr>
-        <w:pStyle w:val="ListBullet"/>
-        <w:spacing w:after="60"/>
-      </w:pPr>
-      <w:r>
-        <w:rPr>
-          <w:b/>
-        </w:rPr>
-        <w:t>Văn phòng phẩm y tế giả định:</w:t>
-      </w:r>
-    </w:p>
-    <w:p>
-      <w:pPr>
-        <w:pStyle w:val="ListBullet"/>
-        <w:spacing w:after="60"/>
-      </w:pPr>
-      <w:r>
-        <w:rPr>
-          <w:b w:val="0"/>
-        </w:rPr>
-        <w:t>Con dấu đỏ có khắc chữ "ĐÃ PHÊ DUYỆT" và 01 hộp mực đóng dấu đỏ.</w:t>
-      </w:r>
-    </w:p>
-    <w:p>
-      <w:pPr>
-        <w:pStyle w:val="ListBullet"/>
-        <w:spacing w:after="60"/>
-      </w:pPr>
-      <w:r>
-        <w:rPr>
-          <w:b w:val="0"/>
-        </w:rPr>
-        <w:t>Băng dính giấy hoặc nam châm gắn bảng dùng để đính bệnh án giấy lên bảng lớn khi hội chẩn.</w:t>
-      </w:r>
-    </w:p>
-    <w:p>
-      <w:pPr>
-        <w:spacing w:after="120"/>
-      </w:pPr>
-    </w:p>
-    <w:p>
-      <w:pPr>
-        <w:pStyle w:val="Heading4"/>
-        <w:spacing w:before="120" w:after="80"/>
-      </w:pPr>
-      <w:r>
-        <w:rPr>
-          <w:b w:val="0"/>
-        </w:rPr>
-        <w:t>2. Học sinh chuẩn bị (mỗi học sinh hoặc mỗi nhóm):</w:t>
-      </w:r>
-    </w:p>
-    <w:p>
-      <w:pPr>
-        <w:pStyle w:val="ListBullet"/>
-        <w:spacing w:after="60"/>
-      </w:pPr>
-      <w:r>
-        <w:rPr>
-          <w:b/>
-        </w:rPr>
-        <w:t>Học cụ cá nhân:</w:t>
-      </w:r>
-    </w:p>
-    <w:p>
-      <w:pPr>
-        <w:pStyle w:val="ListBullet"/>
-        <w:spacing w:after="60"/>
-      </w:pPr>
-      <w:r>
-        <w:rPr>
-          <w:b w:val="0"/>
-        </w:rPr>
-        <w:t>Bút viết cá nhân (bút bi, bút chì).</w:t>
-      </w:r>
-    </w:p>
-    <w:p>
-      <w:pPr>
-        <w:pStyle w:val="ListBullet"/>
-        <w:spacing w:after="60"/>
-      </w:pPr>
-      <w:r>
-        <w:rPr>
-          <w:b w:val="0"/>
-        </w:rPr>
-        <w:t>Bút dạ quang highlighter (màu vàng hoặc xanh sáng) để thực hiện kỹ thuật gạch chân triệu chứng sinh lý cơ thể trên hồ sơ bệnh án giấy.</w:t>
-      </w:r>
-    </w:p>
-    <w:p>
-      <w:pPr>
-        <w:pStyle w:val="ListBullet"/>
-        <w:spacing w:after="60"/>
-      </w:pPr>
-      <w:r>
-        <w:rPr>
-          <w:b w:val="0"/>
-        </w:rPr>
-        <w:t>Phiếu nháp cá nhân.</w:t>
-      </w:r>
-    </w:p>
-    <w:p>
-      <w:pPr>
-        <w:pStyle w:val="ListBullet"/>
-        <w:spacing w:after="60"/>
-      </w:pPr>
-      <w:r>
-        <w:rPr>
-          <w:b/>
-        </w:rPr>
-        <w:t>Thiết bị theo dõi (nếu có):</w:t>
-      </w:r>
-    </w:p>
-    <w:p>
-      <w:pPr>
-        <w:pStyle w:val="ListBullet"/>
-        <w:spacing w:after="60"/>
-      </w:pPr>
-      <w:r>
-        <w:rPr>
-          <w:b w:val="0"/>
-        </w:rPr>
-        <w:t>Đồng hồ đeo tay có kim giây hoặc thiết bị đo nhịp tim đeo tay dùng trong hoạt động đo và đếm nhịp sinh học tự nhiên khi thực hành kỹ thuật thở sâu.</w:t>
+        <w:t xml:space="preserve"> Bút viết, bút dạ quang highlighter.</w:t>
       </w:r>
     </w:p>
     <w:p>
@@ -390,31 +200,7 @@
         <w:rPr>
           <w:b w:val="0"/>
         </w:rPr>
-        <w:t>Giúp học sinh tiếp cận vai trò "Bác sĩ Cảm xúc".</w:t>
-      </w:r>
-    </w:p>
-    <w:p>
-      <w:pPr>
-        <w:pStyle w:val="ListBullet"/>
-        <w:spacing w:after="60"/>
-      </w:pPr>
-      <w:r>
-        <w:rPr>
-          <w:b w:val="0"/>
-        </w:rPr>
-        <w:t>Nhận diện được khái niệm "bão cảm xúc".</w:t>
-      </w:r>
-    </w:p>
-    <w:p>
-      <w:pPr>
-        <w:pStyle w:val="ListBullet"/>
-        <w:spacing w:after="60"/>
-      </w:pPr>
-      <w:r>
-        <w:rPr>
-          <w:b w:val="0"/>
-        </w:rPr>
-        <w:t>Phát hiện nguyên lý y khoa đầu tiên trong kiểm soát cảm xúc là "Tạm dừng phản ứng bản năng".</w:t>
+        <w:t>Nhận diện khái niệm bão cảm xúc và nguyên lý sơ cứu đầu tiên là "Tạm dừng" phản ứng bản năng.</w:t>
       </w:r>
     </w:p>
     <w:p>
@@ -437,31 +223,7 @@
         <w:rPr>
           <w:b w:val="0"/>
         </w:rPr>
-        <w:t>Học sinh quan sát tình huống báo động bão cảm xúc.</w:t>
-      </w:r>
-    </w:p>
-    <w:p>
-      <w:pPr>
-        <w:pStyle w:val="ListBullet"/>
-        <w:spacing w:after="60"/>
-      </w:pPr>
-      <w:r>
-        <w:rPr>
-          <w:b w:val="0"/>
-        </w:rPr>
-        <w:t>Học sinh thảo luận nhóm kíp trực để chọn lựa 3 hành vi sơ cứu ca bệnh giận dữ.</w:t>
-      </w:r>
-    </w:p>
-    <w:p>
-      <w:pPr>
-        <w:pStyle w:val="ListBullet"/>
-        <w:spacing w:after="60"/>
-      </w:pPr>
-      <w:r>
-        <w:rPr>
-          <w:b w:val="0"/>
-        </w:rPr>
-        <w:t>Học sinh đối chiếu kết quả chuẩn y khoa trên thiết bị để rút ra nguyên lý sơ cứu cảm xúc đầu tiên.</w:t>
+        <w:t>Thảo luận nhóm chọn 3 hành vi sơ cứu ca bệnh giận dữ và đối chiếu đáp án chuẩn trên thiết bị.</w:t>
       </w:r>
     </w:p>
     <w:p>
@@ -484,19 +246,7 @@
         <w:rPr>
           <w:b w:val="0"/>
         </w:rPr>
-        <w:t>Phương án sơ cứu được chọn trên thiết bị.</w:t>
-      </w:r>
-    </w:p>
-    <w:p>
-      <w:pPr>
-        <w:pStyle w:val="ListBullet"/>
-        <w:spacing w:after="60"/>
-      </w:pPr>
-      <w:r>
-        <w:rPr>
-          <w:b w:val="0"/>
-        </w:rPr>
-        <w:t>Kết luận của học sinh về hành vi sơ cứu cảm xúc đầu tiên (Tạm dừng).</w:t>
+        <w:t>Phương án sơ cứu chọn trên thiết bị; kết luận của học sinh về hành vi sơ cứu cảm xúc đầu tiên (Tạm dừng).</w:t>
       </w:r>
     </w:p>
     <w:p>
@@ -548,7 +298,7 @@
         <w:rPr>
           <w:b w:val="0"/>
         </w:rPr>
-        <w:t>Giúp học sinh nhận diện khái niệm "bão cảm xúc" và phát hiện ra nguyên lý sơ cứu cảm xúc đầu tiên là "Tạm dừng".</w:t>
+        <w:t>Nhận diện bão cảm xúc và nguyên lý sơ cứu đầu tiên là "Tạm dừng".</w:t>
       </w:r>
     </w:p>
     <w:p>
@@ -584,19 +334,7 @@
         <w:rPr>
           <w:b w:val="0"/>
         </w:rPr>
-        <w:t>Trình chiếu Slide 5-8C, kích hoạt hiệu ứng còi cứu thương khẩn cấp và màn hình nhấp nháy đỏ báo động bão cảm xúc.</w:t>
-      </w:r>
-    </w:p>
-    <w:p>
-      <w:pPr>
-        <w:pStyle w:val="ListBullet"/>
-        <w:spacing w:after="60"/>
-      </w:pPr>
-      <w:r>
-        <w:rPr>
-          <w:b w:val="0"/>
-        </w:rPr>
-        <w:t>Yêu cầu học sinh thảo luận theo nhóm kíp trực để lựa chọn ra 3 hành vi sơ cứu khẩn cấp giúp ca bệnh đang giận dữ.</w:t>
+        <w:t>Trình chiếu Slide 5-8C, phát còi cứu thương báo động; yêu cầu kíp trực thảo luận chọn 3 hành vi sơ cứu ca bệnh đang giận dữ.</w:t>
       </w:r>
     </w:p>
     <w:p>
@@ -620,19 +358,7 @@
         <w:rPr>
           <w:b w:val="0"/>
         </w:rPr>
-        <w:t>Lắng nghe âm thanh cảnh báo, quan sát màn hình tình huống khẩn cấp của bệnh nhân.</w:t>
-      </w:r>
-    </w:p>
-    <w:p>
-      <w:pPr>
-        <w:pStyle w:val="ListBullet"/>
-        <w:spacing w:after="60"/>
-      </w:pPr>
-      <w:r>
-        <w:rPr>
-          <w:b w:val="0"/>
-        </w:rPr>
-        <w:t>Tiếp nhận nhiệm vụ thảo luận nhóm.</w:t>
+        <w:t>Quan sát tình huống bão cảm xúc trên slide; tiếp nhận nhiệm vụ.</w:t>
       </w:r>
     </w:p>
     <w:p>
@@ -668,7 +394,7 @@
         <w:rPr>
           <w:b w:val="0"/>
         </w:rPr>
-        <w:t>Theo dõi, gợi ý học sinh phân biệt giữa hành vi bộc đồng (đập phá đồ đạc, quát tháo) và hành vi sơ cứu lành mạnh (thở sâu, viết cảm xúc, tách không gian).</w:t>
+        <w:t>Theo dõi và hỗ trợ kíp trực thảo luận.</w:t>
       </w:r>
     </w:p>
     <w:p>
@@ -692,19 +418,7 @@
         <w:rPr>
           <w:b w:val="0"/>
         </w:rPr>
-        <w:t>Thảo luận nhóm kíp trực 4 học sinh để đưa ra lựa chọn 3 hành vi sơ cứu.</w:t>
-      </w:r>
-    </w:p>
-    <w:p>
-      <w:pPr>
-        <w:pStyle w:val="ListBullet"/>
-        <w:spacing w:after="60"/>
-      </w:pPr>
-      <w:r>
-        <w:rPr>
-          <w:b w:val="0"/>
-        </w:rPr>
-        <w:t>Cử đại diện thực hiện thao tác kéo thả hoặc tích chọn các phương án trên thiết bị.</w:t>
+        <w:t>Thảo luận nhóm 4 học sinh; đại diện thực hiện kéo thả 3 phương án sơ cứu trên thiết bị.</w:t>
       </w:r>
     </w:p>
     <w:p>
@@ -740,19 +454,7 @@
         <w:rPr>
           <w:b w:val="0"/>
         </w:rPr>
-        <w:t>Tổ chức cho học sinh báo cáo nhanh lý do chọn 3 phương án sơ cứu.</w:t>
-      </w:r>
-    </w:p>
-    <w:p>
-      <w:pPr>
-        <w:pStyle w:val="ListBullet"/>
-        <w:spacing w:after="60"/>
-      </w:pPr>
-      <w:r>
-        <w:rPr>
-          <w:b w:val="0"/>
-        </w:rPr>
-        <w:t>Kích hoạt hiển thị đáp án chuẩn y khoa trên thiết bị.</w:t>
+        <w:t>Tổ chức báo cáo lý do chọn; kích hoạt đáp án chuẩn y khoa trên thiết bị.</w:t>
       </w:r>
     </w:p>
     <w:p>
@@ -776,19 +478,7 @@
         <w:rPr>
           <w:b w:val="0"/>
         </w:rPr>
-        <w:t>Trình bày ngắn gọn lý do kíp trực lựa chọn phương án sơ cứu.</w:t>
-      </w:r>
-    </w:p>
-    <w:p>
-      <w:pPr>
-        <w:pStyle w:val="ListBullet"/>
-        <w:spacing w:after="60"/>
-      </w:pPr>
-      <w:r>
-        <w:rPr>
-          <w:b w:val="0"/>
-        </w:rPr>
-        <w:t>Đối chiếu với kết quả chuẩn y khoa hiển thị trên thiết bị.</w:t>
+        <w:t>Trình bày lý do chọn; đối chiếu đáp án chuẩn trên thiết bị.</w:t>
       </w:r>
     </w:p>
     <w:p>
@@ -824,7 +514,7 @@
         <w:rPr>
           <w:b w:val="0"/>
         </w:rPr>
-        <w:t>Nhận xét và chốt nguyên lý sơ cứu cảm xúc đầu tiên: Trong sơ cứu cảm xúc, bước đầu tiên phải là "tạm dừng" phản ứng bản năng ngay lập tức để tránh làm tổn thương bản thân và người khác.</w:t>
+        <w:t>Chốt nguyên lý sơ cứu cảm xúc đầu tiên là tạm dừng phản ứng bản năng.</w:t>
       </w:r>
     </w:p>
     <w:p>
@@ -848,7 +538,7 @@
         <w:rPr>
           <w:b w:val="0"/>
         </w:rPr>
-        <w:t>Ghi nhận nguyên lý "Tạm dừng" vào vở ghi.</w:t>
+        <w:t>Ghi nhận nguyên lý "Tạm dừng" vào vở.</w:t>
       </w:r>
     </w:p>
     <w:p>
@@ -901,31 +591,7 @@
         <w:rPr>
           <w:b w:val="0"/>
         </w:rPr>
-        <w:t>Phân tích triệu chứng sinh lý của 4 cảm xúc mạnh: giận dữ, buồn bã, lo âu, tự ti.</w:t>
-      </w:r>
-    </w:p>
-    <w:p>
-      <w:pPr>
-        <w:pStyle w:val="ListBullet"/>
-        <w:spacing w:after="60"/>
-      </w:pPr>
-      <w:r>
-        <w:rPr>
-          <w:b w:val="0"/>
-        </w:rPr>
-        <w:t>Chẩn đoán cơ chế mất cân bằng sinh lý não bộ tuổi dậy thì (hạch hạnh nhân hoạt động quá mức trong khi vỏ não trước trán chưa hoàn thiện myelin hóa).</w:t>
-      </w:r>
-    </w:p>
-    <w:p>
-      <w:pPr>
-        <w:pStyle w:val="ListBullet"/>
-        <w:spacing w:after="60"/>
-      </w:pPr>
-      <w:r>
-        <w:rPr>
-          <w:b w:val="0"/>
-        </w:rPr>
-        <w:t>Nắm vững phác đồ 5 bước điều hòa cảm xúc và thực hành đúng kỹ thuật thở sâu hạ nhịp tim.</w:t>
+        <w:t>Xác định triệu chứng vật lý cơ thể và cơ chế mất cân bằng của bộ não dậy thì; thực hành phác đồ 5 bước và kỹ thuật thở sâu.</w:t>
       </w:r>
     </w:p>
     <w:p>
@@ -948,31 +614,7 @@
         <w:rPr>
           <w:b w:val="0"/>
         </w:rPr>
-        <w:t>Học sinh đọc bệnh án, gạch chân triệu chứng sinh lý và nhấp chọn từ khóa trên thiết bị.</w:t>
-      </w:r>
-    </w:p>
-    <w:p>
-      <w:pPr>
-        <w:pStyle w:val="ListBullet"/>
-        <w:spacing w:after="60"/>
-      </w:pPr>
-      <w:r>
-        <w:rPr>
-          <w:b w:val="0"/>
-        </w:rPr>
-        <w:t>Học sinh thảo luận cabin não bộ dậy thì bằng game kéo thả chẩn đoán sinh học.</w:t>
-      </w:r>
-    </w:p>
-    <w:p>
-      <w:pPr>
-        <w:pStyle w:val="ListBullet"/>
-        <w:spacing w:after="60"/>
-      </w:pPr>
-      <w:r>
-        <w:rPr>
-          <w:b w:val="0"/>
-        </w:rPr>
-        <w:t>Học sinh tham gia trò chơi sắp xếp phác đồ điều hòa cảm xúc 5 bước và thực hành thở sâu theo vòng tròn động.</w:t>
+        <w:t>Đọc hồ sơ bệnh án, gạch chân triệu chứng vật lý; thảo luận cơ chế não bộ và sắp xếp thứ tự phác đồ 5 bước.</w:t>
       </w:r>
     </w:p>
     <w:p>
@@ -1071,7 +713,7 @@
         <w:rPr>
           <w:b w:val="0"/>
         </w:rPr>
-        <w:t>Giúp học sinh bốc thăm ngẫu nhiên hồ sơ bệnh án và chuẩn bị kíp trực để phân tích ca bệnh.</w:t>
+        <w:t>Nhận hồ sơ ca bệnh lâm sàng ngẫu nhiên.</w:t>
       </w:r>
     </w:p>
     <w:p>
@@ -1107,19 +749,7 @@
         <w:rPr>
           <w:b w:val="0"/>
         </w:rPr>
-        <w:t>Phát hồ sơ bệnh án giấy in sẵn cho 4 nhóm kíp trực (Su, Minh Anh, Kem, Bảo Vy).</w:t>
-      </w:r>
-    </w:p>
-    <w:p>
-      <w:pPr>
-        <w:pStyle w:val="ListBullet"/>
-        <w:spacing w:after="60"/>
-      </w:pPr>
-      <w:r>
-        <w:rPr>
-          <w:b w:val="0"/>
-        </w:rPr>
-        <w:t>Hướng dẫn học sinh nhấn nút quay số trên Slide 9-10 để bốc thăm ca bệnh ngẫu nhiên.</w:t>
+        <w:t>Hướng dẫn nhấn nút quay số trên Slide 9-10 để bốc thăm ca bệnh.</w:t>
       </w:r>
     </w:p>
     <w:p>
@@ -1143,7 +773,7 @@
         <w:rPr>
           <w:b w:val="0"/>
         </w:rPr>
-        <w:t>Thực hiện nhấn nút bốc thăm ca bệnh trên thiết bị và sẵn sàng nhận bệnh án.</w:t>
+        <w:t>Nhấn nút quay số bốc thăm ca bệnh trên thiết bị.</w:t>
       </w:r>
     </w:p>
     <w:p>
@@ -1179,7 +809,7 @@
         <w:rPr>
           <w:b w:val="0"/>
         </w:rPr>
-        <w:t>Chuẩn bị phiếu "Hồ sơ bệnh án" cho 4 ca bệnh để phát cho các kíp trực.</w:t>
+        <w:t>Chuẩn bị và phát hồ sơ bệnh án giấy (Su, Minh Anh, Kem, Bảo Vy) cho các nhóm.</w:t>
       </w:r>
     </w:p>
     <w:p>
@@ -1203,19 +833,7 @@
         <w:rPr>
           <w:b w:val="0"/>
         </w:rPr>
-        <w:t>Thực hiện chia nhóm 4 học sinh.</w:t>
-      </w:r>
-    </w:p>
-    <w:p>
-      <w:pPr>
-        <w:pStyle w:val="ListBullet"/>
-        <w:spacing w:after="60"/>
-      </w:pPr>
-      <w:r>
-        <w:rPr>
-          <w:b w:val="0"/>
-        </w:rPr>
-        <w:t>Chuẩn bị sẵn bút đánh dấu (bút dạ quang).</w:t>
+        <w:t>Chia nhóm 4 học sinh; chuẩn bị bút dạ quang gạch chân triệu chứng.</w:t>
       </w:r>
     </w:p>
     <w:p>
@@ -1251,7 +869,7 @@
         <w:rPr>
           <w:b w:val="0"/>
         </w:rPr>
-        <w:t>Quan sát quá trình chia sẻ bệnh án và phân công nhiệm vụ của học sinh.</w:t>
+        <w:t>Quan sát và hỗ trợ học sinh chia việc.</w:t>
       </w:r>
     </w:p>
     <w:p>
@@ -1275,7 +893,7 @@
         <w:rPr>
           <w:b w:val="0"/>
         </w:rPr>
-        <w:t>Các kíp trực phân công các vai trò đọc hồ sơ bệnh án giấy trong nhóm.</w:t>
+        <w:t>Nhận bệnh án và phân chia vai trò đọc hồ sơ giấy.</w:t>
       </w:r>
     </w:p>
     <w:p>
@@ -1316,7 +934,7 @@
         <w:rPr>
           <w:b w:val="0"/>
         </w:rPr>
-        <w:t>Giúp học sinh nhận diện và phân tích chính xác các biểu hiện cơ thể khi có cảm xúc mạnh.</w:t>
+        <w:t>Nhận diện phản ứng sinh lý cơ thể khi có cảm xúc mạnh.</w:t>
       </w:r>
     </w:p>
     <w:p>
@@ -1352,19 +970,7 @@
         <w:rPr>
           <w:b w:val="0"/>
         </w:rPr>
-        <w:t>Yêu cầu học sinh đọc kỹ hồ sơ bệnh án giấy, dùng bút dạ quang gạch chân triệu chứng sinh lý cơ thể của nhân vật.</w:t>
-      </w:r>
-    </w:p>
-    <w:p>
-      <w:pPr>
-        <w:pStyle w:val="ListBullet"/>
-        <w:spacing w:after="60"/>
-      </w:pPr>
-      <w:r>
-        <w:rPr>
-          <w:b w:val="0"/>
-        </w:rPr>
-        <w:t>Yêu cầu học sinh lên thiết bị nhấp chọn từ khóa triệu chứng trên Slide 11-14B.</w:t>
+        <w:t>Yêu cầu đọc bệnh án giấy gạch chân triệu chứng; yêu cầu nhấp chọn triệu chứng trên Slide 11-14B.</w:t>
       </w:r>
     </w:p>
     <w:p>
@@ -1388,19 +994,7 @@
         <w:rPr>
           <w:b w:val="0"/>
         </w:rPr>
-        <w:t>Đọc hồ sơ bệnh án giấy được giao.</w:t>
-      </w:r>
-    </w:p>
-    <w:p>
-      <w:pPr>
-        <w:pStyle w:val="ListBullet"/>
-        <w:spacing w:after="60"/>
-      </w:pPr>
-      <w:r>
-        <w:rPr>
-          <w:b w:val="0"/>
-        </w:rPr>
-        <w:t>Tiếp nhận nhiệm vụ gạch chân triệu chứng sinh lý cơ thể trên phiếu giấy.</w:t>
+        <w:t>Đọc bệnh án giấy; nhận nhiệm vụ gạch chân triệu chứng.</w:t>
       </w:r>
     </w:p>
     <w:p>
@@ -1436,7 +1030,7 @@
         <w:rPr>
           <w:b w:val="0"/>
         </w:rPr>
-        <w:t>Hướng dẫn học sinh nhận diện các từ chỉ phản ứng sinh lý vật lý cơ thể (như đỏ bừng mặt, tim đập nhanh, run tay, khóc nghẹn, trốn tránh).</w:t>
+        <w:t>Định hướng từ khóa chỉ phản ứng sinh lý (đỏ mặt, tim đập nhanh, khóc, trốn tránh).</w:t>
       </w:r>
     </w:p>
     <w:p>
@@ -1460,7 +1054,7 @@
         <w:rPr>
           <w:b w:val="0"/>
         </w:rPr>
-        <w:t>Lắng nghe giáo viên định hướng các nhóm từ khóa triệu chứng.</w:t>
+        <w:t>Lắng nghe chỉ dẫn.</w:t>
       </w:r>
     </w:p>
     <w:p>
@@ -1496,7 +1090,7 @@
         <w:rPr>
           <w:b w:val="0"/>
         </w:rPr>
-        <w:t>Quan sát học sinh làm việc nhóm, hỗ trợ kỹ thuật gạch chân vàng trên thiết bị.</w:t>
+        <w:t>Theo dõi nhóm thảo luận gạch chân triệu chứng.</w:t>
       </w:r>
     </w:p>
     <w:p>
@@ -1520,19 +1114,7 @@
         <w:rPr>
           <w:b w:val="0"/>
         </w:rPr>
-        <w:t>Làm việc nhóm gạch chân triệu chứng trên giấy.</w:t>
-      </w:r>
-    </w:p>
-    <w:p>
-      <w:pPr>
-        <w:pStyle w:val="ListBullet"/>
-        <w:spacing w:after="60"/>
-      </w:pPr>
-      <w:r>
-        <w:rPr>
-          <w:b w:val="0"/>
-        </w:rPr>
-        <w:t>Đại diện kíp trực lên thiết bị nhấp chọn từ khóa triệu chứng để kích hoạt gạch chân vàng trên màn hình.</w:t>
+        <w:t>Thảo luận gạch chân triệu chứng trên giấy; đại diện nhấp chọn triệu chứng trên thiết bị.</w:t>
       </w:r>
     </w:p>
     <w:p>
@@ -1568,7 +1150,7 @@
         <w:rPr>
           <w:b w:val="0"/>
         </w:rPr>
-        <w:t>Tổ chức đối chiếu đáp án triệu chứng trên thiết bị.</w:t>
+        <w:t>Đối chiếu đáp án chuẩn triệu chứng trên thiết bị.</w:t>
       </w:r>
     </w:p>
     <w:p>
@@ -1592,7 +1174,7 @@
         <w:rPr>
           <w:b w:val="0"/>
         </w:rPr>
-        <w:t>Nhóm đối chiếu các triệu chứng vật lý đã xác định được với kết quả chuẩn.</w:t>
+        <w:t>Đối chiếu triệu chứng nhóm tìm được với đáp án chuẩn.</w:t>
       </w:r>
     </w:p>
     <w:p>
@@ -1628,7 +1210,7 @@
         <w:rPr>
           <w:b w:val="0"/>
         </w:rPr>
-        <w:t>Chốt các triệu chứng vật lý đặc trưng của từng cảm xúc.</w:t>
+        <w:t>Chốt triệu chứng vật lý đặc trưng của từng cảm xúc.</w:t>
       </w:r>
     </w:p>
     <w:p>
@@ -1652,7 +1234,7 @@
         <w:rPr>
           <w:b w:val="0"/>
         </w:rPr>
-        <w:t>Ghi nhận triệu chứng sinh lý của ca bệnh vào phiếu.</w:t>
+        <w:t>Ghi nhận triệu chứng vào hồ sơ bệnh án.</w:t>
       </w:r>
     </w:p>
     <w:p>
@@ -1693,7 +1275,7 @@
         <w:rPr>
           <w:b w:val="0"/>
         </w:rPr>
-        <w:t>Giúp học sinh giải thích được cơ chế cabin não bộ mất cân bằng sinh lý ở tuổi dậy thì.</w:t>
+        <w:t>Chẩn đoán cơ chế sinh học bộ não tuổi dậy thì.</w:t>
       </w:r>
     </w:p>
     <w:p>
@@ -1729,19 +1311,7 @@
         <w:rPr>
           <w:b w:val="0"/>
         </w:rPr>
-        <w:t>Bật Slide 15-19, kích hoạt đồng hồ đếm ngược 06:00.</w:t>
-      </w:r>
-    </w:p>
-    <w:p>
-      <w:pPr>
-        <w:pStyle w:val="ListBullet"/>
-        <w:spacing w:after="60"/>
-      </w:pPr>
-      <w:r>
-        <w:rPr>
-          <w:b w:val="0"/>
-        </w:rPr>
-        <w:t>Yêu cầu các nhóm thảo luận chẩn đoán cơ chế cabin não bộ.</w:t>
+        <w:t>Bật Slide 15-19, hẹn giờ 06:00, yêu cầu các nhóm thảo luận chẩn đoán cơ chế cabin não bộ.</w:t>
       </w:r>
     </w:p>
     <w:p>
@@ -1765,19 +1335,7 @@
         <w:rPr>
           <w:b w:val="0"/>
         </w:rPr>
-        <w:t>Quan sát mô hình cabin não bộ trên slide.</w:t>
-      </w:r>
-    </w:p>
-    <w:p>
-      <w:pPr>
-        <w:pStyle w:val="ListBullet"/>
-        <w:spacing w:after="60"/>
-      </w:pPr>
-      <w:r>
-        <w:rPr>
-          <w:b w:val="0"/>
-        </w:rPr>
-        <w:t>Tiếp nhận yêu cầu thảo luận nhóm chẩn đoán cơ chế.</w:t>
+        <w:t>Tiếp nhận nhiệm vụ thảo luận chẩn đoán cơ chế não bộ.</w:t>
       </w:r>
     </w:p>
     <w:p>
@@ -1813,7 +1371,7 @@
         <w:rPr>
           <w:b w:val="0"/>
         </w:rPr>
-        <w:t>Hướng dẫn học sinh về cấu trúc cabin não bộ dậy thì: mối quan hệ giữa hạch hạnh nhân (cảm xúc bốc đồng) và vỏ não trước trán (suy nghĩ logic) chưa hoàn thiện quá trình myelin hóa.</w:t>
+        <w:t>Hướng dẫn cấu trúc cabin não bộ: mối quan hệ giữa hạch hạnh nhân (cảm xúc bộc đồng) và vỏ não trước trán (suy nghĩ logic) chưa myelin hóa hoàn thiện.</w:t>
       </w:r>
     </w:p>
     <w:p>
@@ -1837,7 +1395,7 @@
         <w:rPr>
           <w:b w:val="0"/>
         </w:rPr>
-        <w:t>Lắng nghe hướng dẫn cơ chế sinh học bộ não.</w:t>
+        <w:t>Lắng nghe giải thích cơ chế bộ não dậy thì.</w:t>
       </w:r>
     </w:p>
     <w:p>
@@ -1873,7 +1431,7 @@
         <w:rPr>
           <w:b w:val="0"/>
         </w:rPr>
-        <w:t>Theo dõi đồng hồ đếm ngược, hỗ trợ các nhóm giải thích quá trình myelin hóa chưa hoàn thiện ở tuổi dậy thì.</w:t>
+        <w:t>Hỗ trợ nhóm chẩn đoán cơ chế phát triển không đồng bộ của hạch hạnh nhân và vỏ não trước trán.</w:t>
       </w:r>
     </w:p>
     <w:p>
@@ -1897,7 +1455,7 @@
         <w:rPr>
           <w:b w:val="0"/>
         </w:rPr>
-        <w:t>Thảo luận kíp trực viết phiếu chẩn đoán bộ não dậy thì và kéo thả các phương án chẩn đoán trên thiết bị.</w:t>
+        <w:t>Thảo luận kíp trực viết phiếu chẩn đoán và kéo thả phương án chẩn đoán trên thiết bị.</w:t>
       </w:r>
     </w:p>
     <w:p>
@@ -1933,7 +1491,7 @@
         <w:rPr>
           <w:b w:val="0"/>
         </w:rPr>
-        <w:t>Tổ chức đối chiếu kết quả chẩn đoán sinh học trên thiết bị.</w:t>
+        <w:t>Trình chiếu đáp án chẩn đoán sinh học chuẩn trên thiết bị.</w:t>
       </w:r>
     </w:p>
     <w:p>
@@ -1957,7 +1515,7 @@
         <w:rPr>
           <w:b w:val="0"/>
         </w:rPr>
-        <w:t>Đối chiếu cơ chế chẩn đoán chuẩn trên màn hình thiết bị.</w:t>
+        <w:t>Đối chiếu cơ chế chẩn đoán chuẩn trên màn hình.</w:t>
       </w:r>
     </w:p>
     <w:p>
@@ -1998,7 +1556,7 @@
         <w:rPr>
           <w:b w:val="0"/>
         </w:rPr>
-        <w:t>Giúp học sinh củng cố kỹ năng trình bày khoa học và cam kết thực thi y đức.</w:t>
+        <w:t>Thuyết trình kết quả chẩn đoán và cam kết thực thi y đức.</w:t>
       </w:r>
     </w:p>
     <w:p>
@@ -2034,19 +1592,7 @@
         <w:rPr>
           <w:b w:val="0"/>
         </w:rPr>
-        <w:t>Yêu cầu các nhóm cử đại diện thuyết trình chẩn đoán lâm sàng của bệnh nhân.</w:t>
-      </w:r>
-    </w:p>
-    <w:p>
-      <w:pPr>
-        <w:pStyle w:val="ListBullet"/>
-        <w:spacing w:after="60"/>
-      </w:pPr>
-      <w:r>
-        <w:rPr>
-          <w:b w:val="0"/>
-        </w:rPr>
-        <w:t>Hướng dẫn học sinh thực hiện ký cam kết y đức trên slide.</w:t>
+        <w:t>Yêu cầu kíp trực cử đại diện thuyết trình; hướng dẫn ký cam kết trên slide.</w:t>
       </w:r>
     </w:p>
     <w:p>
@@ -2070,7 +1616,7 @@
         <w:rPr>
           <w:b w:val="0"/>
         </w:rPr>
-        <w:t>Tiếp nhận yêu cầu thuyết trình hội chẩn.</w:t>
+        <w:t>Chuẩn bị nội dung báo cáo hội chẩn.</w:t>
       </w:r>
     </w:p>
     <w:p>
@@ -2106,7 +1652,7 @@
         <w:rPr>
           <w:b w:val="0"/>
         </w:rPr>
-        <w:t>Đóng vai trò điều hành hội đồng y khoa, quan sát học sinh tương tác cam kết y đức.</w:t>
+        <w:t>Quan sát học sinh ký cam kết y đức trên slide.</w:t>
       </w:r>
     </w:p>
     <w:p>
@@ -2130,7 +1676,7 @@
         <w:rPr>
           <w:b w:val="0"/>
         </w:rPr>
-        <w:t>Ký tên kíp trực, nhấp nút cam kết y đức để đóng con dấu đỏ "ĐÃ PHÊ DUYỆT" trên thiết bị.</w:t>
+        <w:t>Ký tên kíp trực, nhấp nút đóng dấu đỏ cam kết y đức trên thiết bị.</w:t>
       </w:r>
     </w:p>
     <w:p>
@@ -2166,7 +1712,7 @@
         <w:rPr>
           <w:b w:val="0"/>
         </w:rPr>
-        <w:t>Điều hành phiên hội chẩn của lớp.</w:t>
+        <w:t>Điều hành kíp trực thuyết trình trước lớp.</w:t>
       </w:r>
     </w:p>
     <w:p>
@@ -2190,19 +1736,7 @@
         <w:rPr>
           <w:b w:val="0"/>
         </w:rPr>
-        <w:t>Đại diện các kíp trực lên bục thuyết trình giải thích cơ chế cabin não bộ của ca bệnh nhóm mình trước lớp.</w:t>
-      </w:r>
-    </w:p>
-    <w:p>
-      <w:pPr>
-        <w:pStyle w:val="ListBullet"/>
-        <w:spacing w:after="60"/>
-      </w:pPr>
-      <w:r>
-        <w:rPr>
-          <w:b w:val="0"/>
-        </w:rPr>
-        <w:t>Các nhóm khác nhận xét, đặt câu hỏi thảo luận phản biện.</w:t>
+        <w:t>Đại diện kíp trực lên thuyết trình giải thích cơ chế cabin não bộ của ca bệnh nhóm mình trước lớp.</w:t>
       </w:r>
     </w:p>
     <w:p>
@@ -2238,7 +1772,7 @@
         <w:rPr>
           <w:b w:val="0"/>
         </w:rPr>
-        <w:t>Chốt lại kiến thức khoa học: Cảm xúc tuổi dậy thì thay đổi mạnh mẽ là biểu hiện sinh lý hoàn toàn tự nhiên do sự phát triển lệch pha giữa hạch hạnh nhân và vỏ não trước trán. Quá trình myelin hóa chưa hoàn thiện khiến các đường truyền tín hiệu chưa tối ưu.</w:t>
+        <w:t>Nhận xét và chốt cơ chế não bộ mất cân bằng sinh lý tuổi dậy thì.</w:t>
       </w:r>
     </w:p>
     <w:p>
@@ -2262,7 +1796,7 @@
         <w:rPr>
           <w:b w:val="0"/>
         </w:rPr>
-        <w:t>Ghi nhận kiến thức cơ chế não bộ vào vở ghi.</w:t>
+        <w:t>Ghi nhận kiến thức vào vở.</w:t>
       </w:r>
     </w:p>
     <w:p>
@@ -2303,7 +1837,7 @@
         <w:rPr>
           <w:b w:val="0"/>
         </w:rPr>
-        <w:t>Giúp học sinh thực hành thành thạo phác đồ 5 bước và thực hiện đúng kỹ thuật thở sâu.</w:t>
+        <w:t>Thực hành phác đồ điều hòa 5 bước và kỹ thuật thở sâu hạ nhịp tim.</w:t>
       </w:r>
     </w:p>
     <w:p>
@@ -2339,19 +1873,7 @@
         <w:rPr>
           <w:b w:val="0"/>
         </w:rPr>
-        <w:t>Bật Slide 25-29B, yêu cầu học sinh tham gia trò chơi sắp xếp phác đồ điều hòa cảm xúc 5 bước.</w:t>
-      </w:r>
-    </w:p>
-    <w:p>
-      <w:pPr>
-        <w:pStyle w:val="ListBullet"/>
-        <w:spacing w:after="60"/>
-      </w:pPr>
-      <w:r>
-        <w:rPr>
-          <w:b w:val="0"/>
-        </w:rPr>
-        <w:t>Yêu cầu chuẩn bị thực hành thở theo vòng tròn chuyển động trên màn hình.</w:t>
+        <w:t>Bật Slide 25-29B, yêu cầu sắp xếp phác đồ 5 bước; yêu cầu thực hành thở sâu theo vòng tròn động.</w:t>
       </w:r>
     </w:p>
     <w:p>
@@ -2375,7 +1897,7 @@
         <w:rPr>
           <w:b w:val="0"/>
         </w:rPr>
-        <w:t>Tiếp nhận yêu cầu trò chơi sắp xếp và chuẩn bị thực hành thở sâu.</w:t>
+        <w:t>Nhận nhiệm vụ sắp xếp phác đồ và chuẩn bị thực hành.</w:t>
       </w:r>
     </w:p>
     <w:p>
@@ -2387,7 +1909,7 @@
         <w:rPr>
           <w:b w:val="0"/>
         </w:rPr>
-        <w:t>Chuẩn bị:</w:t>
+        <w:t>Hướng dẫn:</w:t>
       </w:r>
     </w:p>
     <w:p>
@@ -2411,7 +1933,7 @@
         <w:rPr>
           <w:b w:val="0"/>
         </w:rPr>
-        <w:t>Hướng dẫn học sinh đếm nhịp tim tự nhiên của bản thân trong 30 giây (nhân đôi để ra nhịp tim/phút) và ghi nhận lại.</w:t>
+        <w:t>Hướng dẫn tư thế ngồi thẳng lưng và kỹ thuật thở sâu hít phồng bụng - thở xẹp bụng.</w:t>
       </w:r>
     </w:p>
     <w:p>
@@ -2435,7 +1957,7 @@
         <w:rPr>
           <w:b w:val="0"/>
         </w:rPr>
-        <w:t>Thực hiện tự đo nhịp cổ tay và ghi lại chỉ số nhịp tim ban đầu.</w:t>
+        <w:t>Đo nhịp tim ban đầu; quan sát nhịp thở mẫu.</w:t>
       </w:r>
     </w:p>
     <w:p>
@@ -2447,7 +1969,7 @@
         <w:rPr>
           <w:b w:val="0"/>
         </w:rPr>
-        <w:t>Hướng dẫn:</w:t>
+        <w:t>Thực hiện:</w:t>
       </w:r>
     </w:p>
     <w:p>
@@ -2471,7 +1993,7 @@
         <w:rPr>
           <w:b w:val="0"/>
         </w:rPr>
-        <w:t>Chỉ dẫn tư thế ngồi thẳng lưng và kỹ thuật hít vào phồng bụng - thở ra xẹp bụng theo chuyển động của vòng tròn thở động trên slide.</w:t>
+        <w:t>Bật nhạc nhẹ, theo dõi tư thế thở; hướng dẫn đo lại nhịp tim sau khi thực hành thở sâu.</w:t>
       </w:r>
     </w:p>
     <w:p>
@@ -2495,7 +2017,7 @@
         <w:rPr>
           <w:b w:val="0"/>
         </w:rPr>
-        <w:t>Quan sát và thực hành nhịp thở theo giáo viên hướng dẫn.</w:t>
+        <w:t>Sắp xếp phác đồ 5 bước trên thiết bị; thực hành thở sâu theo vòng tròn động trong 3 phút; tự đo lại nhịp tim.</w:t>
       </w:r>
     </w:p>
     <w:p>
@@ -2507,7 +2029,7 @@
         <w:rPr>
           <w:b w:val="0"/>
         </w:rPr>
-        <w:t>Thực hiện:</w:t>
+        <w:t>Báo cáo:</w:t>
       </w:r>
     </w:p>
     <w:p>
@@ -2531,19 +2053,7 @@
         <w:rPr>
           <w:b w:val="0"/>
         </w:rPr>
-        <w:t>Bật nhạc nền nhẹ nhàng, theo dõi và chỉnh sửa tư thế thở cho học sinh.</w:t>
-      </w:r>
-    </w:p>
-    <w:p>
-      <w:pPr>
-        <w:pStyle w:val="ListBullet"/>
-        <w:spacing w:after="60"/>
-      </w:pPr>
-      <w:r>
-        <w:rPr>
-          <w:b w:val="0"/>
-        </w:rPr>
-        <w:t>Hướng dẫn học sinh tự đo lại nhịp tim sau 3 phút thực hành thở sâu.</w:t>
+        <w:t>Yêu cầu chia sẻ chỉ số giảm nhịp tim sau thở sâu.</w:t>
       </w:r>
     </w:p>
     <w:p>
@@ -2567,7 +2077,7 @@
         <w:rPr>
           <w:b w:val="0"/>
         </w:rPr>
-        <w:t>Chơi game sắp xếp thứ tự 5 bước phác đồ trên thiết bị.</w:t>
+        <w:t>Đối chiếu chỉ số nhịp tim trước - sau để cảm nhận cơ thể bình tĩnh lại.</w:t>
       </w:r>
     </w:p>
     <w:p>
@@ -2579,31 +2089,7 @@
         <w:rPr>
           <w:b w:val="0"/>
         </w:rPr>
-        <w:t>Thực hành kỹ thuật thở điều hòa nhịp tim sâu trong 3 phút theo vòng tròn động.</w:t>
-      </w:r>
-    </w:p>
-    <w:p>
-      <w:pPr>
-        <w:pStyle w:val="ListBullet"/>
-        <w:spacing w:after="60"/>
-      </w:pPr>
-      <w:r>
-        <w:rPr>
-          <w:b w:val="0"/>
-        </w:rPr>
-        <w:t>Tự đếm và ghi nhận sự thay đổi nhịp tim của cơ thể sau khi thở.</w:t>
-      </w:r>
-    </w:p>
-    <w:p>
-      <w:pPr>
-        <w:pStyle w:val="ListBullet"/>
-        <w:spacing w:after="60"/>
-      </w:pPr>
-      <w:r>
-        <w:rPr>
-          <w:b w:val="0"/>
-        </w:rPr>
-        <w:t>Báo cáo:</w:t>
+        <w:t>Kết luận:</w:t>
       </w:r>
     </w:p>
     <w:p>
@@ -2627,7 +2113,7 @@
         <w:rPr>
           <w:b w:val="0"/>
         </w:rPr>
-        <w:t>Yêu cầu học sinh chia sẻ sự thay đổi chỉ số nhịp tim trước và sau khi thở.</w:t>
+        <w:t>Khẳng định thở sâu cung cấp oxy cho vỏ não trước trán để kiểm soát hạch hạnh nhân bộc đồng.</w:t>
       </w:r>
     </w:p>
     <w:p>
@@ -2651,79 +2137,7 @@
         <w:rPr>
           <w:b w:val="0"/>
         </w:rPr>
-        <w:t>Trình bày kết quả đo nhịp tim trước - sau.</w:t>
-      </w:r>
-    </w:p>
-    <w:p>
-      <w:pPr>
-        <w:pStyle w:val="ListBullet"/>
-        <w:spacing w:after="60"/>
-      </w:pPr>
-      <w:r>
-        <w:rPr>
-          <w:b w:val="0"/>
-        </w:rPr>
-        <w:t>Thảo luận về tác dụng của kỹ thuật thở sâu đối với việc làm dịu hạch hạnh nhân hoạt động quá mức.</w:t>
-      </w:r>
-    </w:p>
-    <w:p>
-      <w:pPr>
-        <w:pStyle w:val="ListBullet"/>
-        <w:spacing w:after="60"/>
-      </w:pPr>
-      <w:r>
-        <w:rPr>
-          <w:b w:val="0"/>
-        </w:rPr>
-        <w:t>Kết luận:</w:t>
-      </w:r>
-    </w:p>
-    <w:p>
-      <w:pPr>
-        <w:pStyle w:val="ListBullet2"/>
-        <w:spacing w:after="60"/>
-      </w:pPr>
-      <w:r>
-        <w:rPr>
-          <w:b w:val="0"/>
-        </w:rPr>
-        <w:t>Giáo viên:</w:t>
-      </w:r>
-    </w:p>
-    <w:p>
-      <w:pPr>
-        <w:pStyle w:val="ListBullet"/>
-        <w:spacing w:after="60"/>
-      </w:pPr>
-      <w:r>
-        <w:rPr>
-          <w:b w:val="0"/>
-        </w:rPr>
-        <w:t>Nhấn mạnh: Việc thở sâu là giải pháp khoa học thực chứng làm dịu hạch hạnh nhân, cung cấp oxy cho vỏ não trước trán giúp kiểm soát hành vi.</w:t>
-      </w:r>
-    </w:p>
-    <w:p>
-      <w:pPr>
-        <w:pStyle w:val="ListBullet2"/>
-        <w:spacing w:after="60"/>
-      </w:pPr>
-      <w:r>
-        <w:rPr>
-          <w:b w:val="0"/>
-        </w:rPr>
-        <w:t>Học sinh:</w:t>
-      </w:r>
-    </w:p>
-    <w:p>
-      <w:pPr>
-        <w:pStyle w:val="ListBullet"/>
-        <w:spacing w:after="60"/>
-      </w:pPr>
-      <w:r>
-        <w:rPr>
-          <w:b w:val="0"/>
-        </w:rPr>
-        <w:t>Ghi nhận phác đồ 5 bước điều hòa cảm xúc vào vở.</w:t>
+        <w:t>Ghi nhận phác đồ 5 bước điều hòa cảm xúc.</w:t>
       </w:r>
     </w:p>
     <w:p>
@@ -2776,19 +2190,7 @@
         <w:rPr>
           <w:b w:val="0"/>
         </w:rPr>
-        <w:t>Giúp học sinh phân biệt được hành vi nên làm (lành mạnh) và không nên làm (rủi ro) khi gặp bão cảm xúc.</w:t>
-      </w:r>
-    </w:p>
-    <w:p>
-      <w:pPr>
-        <w:pStyle w:val="ListBullet"/>
-        <w:spacing w:after="60"/>
-      </w:pPr>
-      <w:r>
-        <w:rPr>
-          <w:b w:val="0"/>
-        </w:rPr>
-        <w:t>Rèn luyện kỹ năng lựa chọn giải pháp điều hòa cảm xúc thích ứng.</w:t>
+        <w:t>Phân biệt hành vi nên và không nên làm khi gặp bão cảm xúc.</w:t>
       </w:r>
     </w:p>
     <w:p>
@@ -2811,7 +2213,7 @@
         <w:rPr>
           <w:b w:val="0"/>
         </w:rPr>
-        <w:t>Học sinh thảo luận nhóm để phân loại 8 hành vi ứng phó trên bảng phân loại.</w:t>
+        <w:t>Phân loại các hành vi ứng phó trên bảng phân loại.</w:t>
       </w:r>
     </w:p>
     <w:p>
@@ -2835,18 +2237,6 @@
           <w:b w:val="0"/>
         </w:rPr>
         <w:t>Bảng phân loại hành vi hoàn thiện chính xác.</w:t>
-      </w:r>
-    </w:p>
-    <w:p>
-      <w:pPr>
-        <w:pStyle w:val="ListBullet"/>
-        <w:spacing w:after="60"/>
-      </w:pPr>
-      <w:r>
-        <w:rPr>
-          <w:b w:val="0"/>
-        </w:rPr>
-        <w:t>Quyết định hành vi lành mạnh được học sinh tự xác định và ghi nhận.</w:t>
       </w:r>
     </w:p>
     <w:p>
@@ -2898,7 +2288,7 @@
         <w:rPr>
           <w:b w:val="0"/>
         </w:rPr>
-        <w:t>Giúp học sinh tự phân loại các hành động an toàn/rủi ro để áp dụng giải pháp sơ cứu thích hợp.</w:t>
+        <w:t>Tự phân biệt hành vi an toàn và rủi ro để chọn giải pháp thích ứng.</w:t>
       </w:r>
     </w:p>
     <w:p>
@@ -2934,7 +2324,7 @@
         <w:rPr>
           <w:b w:val="0"/>
         </w:rPr>
-        <w:t>Trình chiếu Slide 30-34, yêu cầu học sinh thảo luận phân loại các hành vi ứng phó khi gặp cảm xúc mạnh thành hai nhóm: "Nên làm" và "Không nên làm" trên bảng phân loại.</w:t>
+        <w:t>Trình chiếu Slide 30-34, yêu cầu học sinh thảo luận phân loại 8 hành vi ứng phó lên bảng phân loại.</w:t>
       </w:r>
     </w:p>
     <w:p>
@@ -2958,7 +2348,7 @@
         <w:rPr>
           <w:b w:val="0"/>
         </w:rPr>
-        <w:t>Quan sát bảng phân loại trên thiết bị và nhận diện các hành vi cần phân loại.</w:t>
+        <w:t>Quan sát bảng phân loại trên thiết bị; nhận nhiệm vụ.</w:t>
       </w:r>
     </w:p>
     <w:p>
@@ -2994,7 +2384,7 @@
         <w:rPr>
           <w:b w:val="0"/>
         </w:rPr>
-        <w:t>Theo dõi, gợi ý học sinh phân tích hậu quả của việc dồn nén cảm xúc hoặc đập phá đồ đạc.</w:t>
+        <w:t>Gợi ý phân tích tác hại của việc đập phá đồ đạc hoặc trút giận lên mạng xã hội.</w:t>
       </w:r>
     </w:p>
     <w:p>
@@ -3018,19 +2408,7 @@
         <w:rPr>
           <w:b w:val="0"/>
         </w:rPr>
-        <w:t>Thảo luận kíp trực 4 học sinh phân tích các hành vi.</w:t>
-      </w:r>
-    </w:p>
-    <w:p>
-      <w:pPr>
-        <w:pStyle w:val="ListBullet"/>
-        <w:spacing w:after="60"/>
-      </w:pPr>
-      <w:r>
-        <w:rPr>
-          <w:b w:val="0"/>
-        </w:rPr>
-        <w:t>Đại diện thực hiện kéo thả phân loại các thẻ hành vi trên thiết bị (Ví dụ: Nên làm: Thở sâu, Chia sẻ với người tin cậy; Không nên làm: Đập phá đồ đạc, Viết bài nói xấu trên mạng).</w:t>
+        <w:t>Thảo luận nhóm 4 học sinh; đại diện kéo thả phân loại các thẻ hành vi trên thiết bị.</w:t>
       </w:r>
     </w:p>
     <w:p>
@@ -3066,7 +2444,7 @@
         <w:rPr>
           <w:b w:val="0"/>
         </w:rPr>
-        <w:t>Nhận xét và công bố kết quả phân loại chuẩn y khoa trên thiết bị.</w:t>
+        <w:t>Nhận xét và hiển thị đáp án chuẩn trên thiết bị.</w:t>
       </w:r>
     </w:p>
     <w:p>
@@ -3090,7 +2468,7 @@
         <w:rPr>
           <w:b w:val="0"/>
         </w:rPr>
-        <w:t>Nhóm báo cáo và đối chiếu kết quả phân loại chuẩn y khoa.</w:t>
+        <w:t>Nhóm báo cáo và đối chiếu kết quả chuẩn.</w:t>
       </w:r>
     </w:p>
     <w:p>
@@ -3126,7 +2504,7 @@
         <w:rPr>
           <w:b w:val="0"/>
         </w:rPr>
-        <w:t>Nhận xét kết quả làm bài tập của các nhóm; nhắc nhở học sinh luôn đối chiếu hành vi thực tế với phác đồ điều hòa lành mạnh để tránh biến chứng.</w:t>
+        <w:t>Chốt tầm quan trọng của việc chọn hành vi lành mạnh để tránh biến chứng.</w:t>
       </w:r>
     </w:p>
     <w:p>
@@ -3150,7 +2528,7 @@
         <w:rPr>
           <w:b w:val="0"/>
         </w:rPr>
-        <w:t>Thu dọn tài liệu học tập của Tiết 1.</w:t>
+        <w:t>Thu dọn tài liệu Tiết 1.</w:t>
       </w:r>
     </w:p>
     <w:p>
@@ -3203,19 +2581,7 @@
         <w:rPr>
           <w:b w:val="0"/>
         </w:rPr>
-        <w:t>Học sinh hình thành thói quen tự phản tư và tự theo dõi cảm xúc cá nhân hàng ngày.</w:t>
-      </w:r>
-    </w:p>
-    <w:p>
-      <w:pPr>
-        <w:pStyle w:val="ListBullet"/>
-        <w:spacing w:after="60"/>
-      </w:pPr>
-      <w:r>
-        <w:rPr>
-          <w:b w:val="0"/>
-        </w:rPr>
-        <w:t>Đánh giá năng lực tự chủ điều hòa cảm xúc của học sinh ngoài giờ lên lớp.</w:t>
+        <w:t>Theo dõi và phản tư cảm xúc cá nhân hàng ngày ngoài giờ lên lớp.</w:t>
       </w:r>
     </w:p>
     <w:p>
@@ -3238,19 +2604,7 @@
         <w:rPr>
           <w:b w:val="0"/>
         </w:rPr>
-        <w:t>Học sinh nhận phiếu nhật ký phản tư cảm xúc mẫu.</w:t>
-      </w:r>
-    </w:p>
-    <w:p>
-      <w:pPr>
-        <w:pStyle w:val="ListBullet"/>
-        <w:spacing w:after="60"/>
-      </w:pPr>
-      <w:r>
-        <w:rPr>
-          <w:b w:val="0"/>
-        </w:rPr>
-        <w:t>Học sinh tự theo dõi và ghi chép cảm xúc cá nhân mỗi tối tại nhà.</w:t>
+        <w:t>Học sinh nhận phiếu nhật ký mẫu và ghi chép cảm xúc mỗi tối tại nhà.</w:t>
       </w:r>
     </w:p>
     <w:p>
@@ -3274,18 +2628,6 @@
           <w:b w:val="0"/>
         </w:rPr>
         <w:t>Phiếu nhật ký phản tư cảm xúc mẫu được hoàn thành phần ngày đầu tiên.</w:t>
-      </w:r>
-    </w:p>
-    <w:p>
-      <w:pPr>
-        <w:pStyle w:val="ListBullet"/>
-        <w:spacing w:after="60"/>
-      </w:pPr>
-      <w:r>
-        <w:rPr>
-          <w:b w:val="0"/>
-        </w:rPr>
-        <w:t>Nhật ký ghi lại quá trình điều hòa cảm xúc thực tế của học sinh.</w:t>
       </w:r>
     </w:p>
     <w:p>
@@ -3337,7 +2679,7 @@
         <w:rPr>
           <w:b w:val="0"/>
         </w:rPr>
-        <w:t>Giúp học sinh củng cố thói quen tự phản tư và đánh giá cảm xúc bản thân hàng ngày.</w:t>
+        <w:t>Thiết lập thói quen tự phản tư cảm xúc hàng ngày.</w:t>
       </w:r>
     </w:p>
     <w:p>
@@ -3373,19 +2715,7 @@
         <w:rPr>
           <w:b w:val="0"/>
         </w:rPr>
-        <w:t>Trình chiếu Slide 35, giao nhiệm vụ viết nhật ký phản tư cảm xúc mỗi tối ở nhà.</w:t>
-      </w:r>
-    </w:p>
-    <w:p>
-      <w:pPr>
-        <w:pStyle w:val="ListBullet"/>
-        <w:spacing w:after="60"/>
-      </w:pPr>
-      <w:r>
-        <w:rPr>
-          <w:b w:val="0"/>
-        </w:rPr>
-        <w:t>Phát phiếu giấy nhật ký phản tư cảm xúc mẫu cho từng học sinh.</w:t>
+        <w:t>Trình chiếu Slide 35, giao nhiệm vụ viết nhật ký phản tư cảm xúc tại nhà; phát phiếu nhật ký mẫu.</w:t>
       </w:r>
     </w:p>
     <w:p>
@@ -3409,19 +2739,7 @@
         <w:rPr>
           <w:b w:val="0"/>
         </w:rPr>
-        <w:t>Nhận phiếu giấy nhật ký phản tư cảm xúc.</w:t>
-      </w:r>
-    </w:p>
-    <w:p>
-      <w:pPr>
-        <w:pStyle w:val="ListBullet"/>
-        <w:spacing w:after="60"/>
-      </w:pPr>
-      <w:r>
-        <w:rPr>
-          <w:b w:val="0"/>
-        </w:rPr>
-        <w:t>Tiếp nhận nhiệm vụ viết nhật ký phản tư tại nhà của giáo viên.</w:t>
+        <w:t>Nhận phiếu giấy nhật ký phản tư cảm xúc mẫu từ giáo viên.</w:t>
       </w:r>
     </w:p>
     <w:p>
@@ -3457,7 +2775,7 @@
         <w:rPr>
           <w:b w:val="0"/>
         </w:rPr>
-        <w:t>Theo dõi học sinh nhận phiếu, nhắc nhở thời gian và độ chân thật khi hoàn thành.</w:t>
+        <w:t>Nhắc nhở thời gian và tính trung thực khi ghi nhật ký.</w:t>
       </w:r>
     </w:p>
     <w:p>
@@ -3481,7 +2799,7 @@
         <w:rPr>
           <w:b w:val="0"/>
         </w:rPr>
-        <w:t>Thực hiện ghi chép cảm xúc cá nhân định kỳ mỗi tối tại nhà.</w:t>
+        <w:t>Thực hiện ghi chép cảm xúc cá nhân mỗi tối tại nhà.</w:t>
       </w:r>
     </w:p>
     <w:p>
@@ -3517,7 +2835,7 @@
         <w:rPr>
           <w:b w:val="0"/>
         </w:rPr>
-        <w:t>Nêu rõ yêu cầu học sinh sẽ chia sẻ nhật ký trong tiết học sau (Tiết 2).</w:t>
+        <w:t>Yêu cầu học sinh chia sẻ nhật ký trong buổi học sau.</w:t>
       </w:r>
     </w:p>
     <w:p>
@@ -3541,7 +2859,7 @@
         <w:rPr>
           <w:b w:val="0"/>
         </w:rPr>
-        <w:t>Ghi nhận lịch báo cáo kết quả nhật ký phản tư.</w:t>
+        <w:t>Ghi nhận lịch báo cáo kết quả.</w:t>
       </w:r>
     </w:p>
     <w:p>
@@ -3577,19 +2895,7 @@
         <w:rPr>
           <w:b w:val="0"/>
         </w:rPr>
-        <w:t>Khép lại tiết học bằng việc trao vinh danh bác sĩ thực tập cho cả lớp.</w:t>
-      </w:r>
-    </w:p>
-    <w:p>
-      <w:pPr>
-        <w:pStyle w:val="ListBullet"/>
-        <w:spacing w:after="60"/>
-      </w:pPr>
-      <w:r>
-        <w:rPr>
-          <w:b w:val="0"/>
-        </w:rPr>
-        <w:t>Nhấn mạnh việc hình thành thói quen tự phản tư là chìa khóa để điều hòa cảm xúc lâu dài.</w:t>
+        <w:t>Vinh danh bác sĩ thực tập; chốt thói quen phản tư là chìa khóa điều hòa cảm xúc bền vững.</w:t>
       </w:r>
     </w:p>
     <w:p>
@@ -3613,7 +2919,7 @@
         <w:rPr>
           <w:b w:val="0"/>
         </w:rPr>
-        <w:t>Lắng nghe và kết thúc tiết học.</w:t>
+        <w:t>Chào giáo viên kết thúc tiết học.</w:t>
       </w:r>
     </w:p>
     <w:p>
@@ -3661,7 +2967,7 @@
         <w:rPr>
           <w:b w:val="0"/>
         </w:rPr>
-        <w:t xml:space="preserve"> Học sinh chẩn đoán chính xác cơ chế sinh lý tuổi dậy thì (hạch hạnh nhân và vỏ não trước trán) và gọi tên đúng 4 nhóm cảm xúc.</w:t>
+        <w:t xml:space="preserve"> Chẩn đoán chính xác cơ chế sinh lý bộ não dậy thì và gọi tên 4 cảm xúc.</w:t>
       </w:r>
     </w:p>
     <w:p>
@@ -3679,7 +2985,7 @@
         <w:rPr>
           <w:b w:val="0"/>
         </w:rPr>
-        <w:t xml:space="preserve"> Thực hành đúng kỹ thuật thở điều hòa nhịp tim trong 3 phút.</w:t>
+        <w:t xml:space="preserve"> Thực hành đúng kỹ thuật thở sâu hạ nhịp tim trong 3 phút.</w:t>
       </w:r>
     </w:p>
     <w:p>
@@ -3697,7 +3003,7 @@
         <w:rPr>
           <w:b w:val="0"/>
         </w:rPr>
-        <w:t xml:space="preserve"> Tinh thần trách nhiệm, chủ động nhập vai bác sĩ thấu cảm cứu chữa ca bệnh và hoàn thành đầy đủ cam kết y đức.</w:t>
+        <w:t xml:space="preserve"> Chủ động nhập vai bác sĩ thấu cảm và hoàn thành đầy đủ cam kết y đức.</w:t>
       </w:r>
     </w:p>
     <w:sectPr>

</xml_diff>